<commit_message>
Remove duplicate full code appendices from report
</commit_message>
<xml_diff>
--- a/report.docx
+++ b/report.docx
@@ -2303,1955 +2303,6 @@
         <w:rPr>
           <w:color w:val="000000"/>
         </w:rPr>
-        <w:t>Полный код программы</w:t>
-      </w:r>
-    </w:p>
-    <w:p>
-      <w:pPr>
-        <w:pStyle w:val="a"/>
-        <w:ind w:firstLine="709"/>
-        <w:widowControl/>
-        <w:jc w:val="both"/>
-        <w:spacing w:before="0" w:after="160" w:line="259" w:lineRule="auto"/>
-      </w:pPr>
-      <w:r>
-        <w:rPr>
-          <w:rFonts w:ascii="Times New Roman" w:hAnsi="Times New Roman" w:cs="Times New Roman"/>
-          <w:sz w:val="24"/>
-          <w:color w:val="000000"/>
-        </w:rPr>
-        <w:t xml:space="preserve">Файл Main.java строки 1–38</w:t>
-      </w:r>
-    </w:p>
-    <w:p>
-      <w:pPr>
-        <w:pStyle w:val="a"/>
-        <w:widowControl/>
-        <w:jc w:val="left"/>
-        <w:spacing w:before="0" w:after="0" w:line="220" w:lineRule="exact"/>
-      </w:pPr>
-      <w:r>
-        <w:rPr>
-          <w:rFonts w:ascii="Consolas" w:hAnsi="Consolas" w:cs="Times New Roman"/>
-          <w:sz w:val="20"/>
-          <w:color w:val="000000"/>
-        </w:rPr>
-        <w:t xml:space="preserve">import java.util.Scanner;</w:t>
-      </w:r>
-    </w:p>
-    <w:p>
-      <w:pPr>
-        <w:pStyle w:val="a"/>
-        <w:widowControl/>
-        <w:jc w:val="left"/>
-        <w:spacing w:before="0" w:after="0" w:line="220" w:lineRule="exact"/>
-      </w:pPr>
-      <w:r>
-        <w:rPr>
-          <w:rFonts w:ascii="Consolas" w:hAnsi="Consolas" w:cs="Times New Roman"/>
-          <w:sz w:val="20"/>
-          <w:color w:val="000000"/>
-        </w:rPr>
-        <w:t xml:space="preserve">import java.time.Year;</w:t>
-      </w:r>
-    </w:p>
-    <w:p>
-      <w:pPr>
-        <w:pStyle w:val="a"/>
-        <w:widowControl/>
-        <w:jc w:val="left"/>
-        <w:spacing w:before="0" w:after="0" w:line="220" w:lineRule="exact"/>
-      </w:pPr>
-      <w:r>
-        <w:rPr>
-          <w:rFonts w:ascii="Consolas" w:hAnsi="Consolas" w:cs="Times New Roman"/>
-          <w:sz w:val="20"/>
-          <w:color w:val="000000"/>
-        </w:rPr>
-        <w:t xml:space="preserve"/>
-      </w:r>
-    </w:p>
-    <w:p>
-      <w:pPr>
-        <w:pStyle w:val="a"/>
-        <w:widowControl/>
-        <w:jc w:val="left"/>
-        <w:spacing w:before="0" w:after="0" w:line="220" w:lineRule="exact"/>
-      </w:pPr>
-      <w:r>
-        <w:rPr>
-          <w:rFonts w:ascii="Consolas" w:hAnsi="Consolas" w:cs="Times New Roman"/>
-          <w:sz w:val="20"/>
-          <w:color w:val="000000"/>
-        </w:rPr>
-        <w:t xml:space="preserve">public class Main {</w:t>
-      </w:r>
-    </w:p>
-    <w:p>
-      <w:pPr>
-        <w:pStyle w:val="a"/>
-        <w:widowControl/>
-        <w:jc w:val="left"/>
-        <w:spacing w:before="0" w:after="0" w:line="220" w:lineRule="exact"/>
-      </w:pPr>
-      <w:r>
-        <w:rPr>
-          <w:rFonts w:ascii="Consolas" w:hAnsi="Consolas" w:cs="Times New Roman"/>
-          <w:sz w:val="20"/>
-          <w:color w:val="000000"/>
-        </w:rPr>
-        <w:t xml:space="preserve">    public static void main(String[] args) {</w:t>
-      </w:r>
-    </w:p>
-    <w:p>
-      <w:pPr>
-        <w:pStyle w:val="a"/>
-        <w:widowControl/>
-        <w:jc w:val="left"/>
-        <w:spacing w:before="0" w:after="0" w:line="220" w:lineRule="exact"/>
-      </w:pPr>
-      <w:r>
-        <w:rPr>
-          <w:rFonts w:ascii="Consolas" w:hAnsi="Consolas" w:cs="Times New Roman"/>
-          <w:sz w:val="20"/>
-          <w:color w:val="000000"/>
-        </w:rPr>
-        <w:t xml:space="preserve">        Scanner input = new Scanner(System.in);</w:t>
-      </w:r>
-    </w:p>
-    <w:p>
-      <w:pPr>
-        <w:pStyle w:val="a"/>
-        <w:widowControl/>
-        <w:jc w:val="left"/>
-        <w:spacing w:before="0" w:after="0" w:line="220" w:lineRule="exact"/>
-      </w:pPr>
-      <w:r>
-        <w:rPr>
-          <w:rFonts w:ascii="Consolas" w:hAnsi="Consolas" w:cs="Times New Roman"/>
-          <w:sz w:val="20"/>
-          <w:color w:val="000000"/>
-        </w:rPr>
-        <w:t xml:space="preserve">        while (true) {</w:t>
-      </w:r>
-    </w:p>
-    <w:p>
-      <w:pPr>
-        <w:pStyle w:val="a"/>
-        <w:widowControl/>
-        <w:jc w:val="left"/>
-        <w:spacing w:before="0" w:after="0" w:line="220" w:lineRule="exact"/>
-      </w:pPr>
-      <w:r>
-        <w:rPr>
-          <w:rFonts w:ascii="Consolas" w:hAnsi="Consolas" w:cs="Times New Roman"/>
-          <w:sz w:val="20"/>
-          <w:color w:val="000000"/>
-        </w:rPr>
-        <w:t xml:space="preserve">            System.out.println("\n1 - BMI\n2 - Обменник\n3 - Обменник с окончаниями\n4 - Автомобили\n0 - Выход");</w:t>
-      </w:r>
-    </w:p>
-    <w:p>
-      <w:pPr>
-        <w:pStyle w:val="a"/>
-        <w:widowControl/>
-        <w:jc w:val="left"/>
-        <w:spacing w:before="0" w:after="0" w:line="220" w:lineRule="exact"/>
-      </w:pPr>
-      <w:r>
-        <w:rPr>
-          <w:rFonts w:ascii="Consolas" w:hAnsi="Consolas" w:cs="Times New Roman"/>
-          <w:sz w:val="20"/>
-          <w:color w:val="000000"/>
-        </w:rPr>
-        <w:t xml:space="preserve">            int choice = input.nextInt();</w:t>
-      </w:r>
-    </w:p>
-    <w:p>
-      <w:pPr>
-        <w:pStyle w:val="a"/>
-        <w:widowControl/>
-        <w:jc w:val="left"/>
-        <w:spacing w:before="0" w:after="0" w:line="220" w:lineRule="exact"/>
-      </w:pPr>
-      <w:r>
-        <w:rPr>
-          <w:rFonts w:ascii="Consolas" w:hAnsi="Consolas" w:cs="Times New Roman"/>
-          <w:sz w:val="20"/>
-          <w:color w:val="000000"/>
-        </w:rPr>
-        <w:t xml:space="preserve">            if (choice == 0) break;</w:t>
-      </w:r>
-    </w:p>
-    <w:p>
-      <w:pPr>
-        <w:pStyle w:val="a"/>
-        <w:widowControl/>
-        <w:jc w:val="left"/>
-        <w:spacing w:before="0" w:after="0" w:line="220" w:lineRule="exact"/>
-      </w:pPr>
-      <w:r>
-        <w:rPr>
-          <w:rFonts w:ascii="Consolas" w:hAnsi="Consolas" w:cs="Times New Roman"/>
-          <w:sz w:val="20"/>
-          <w:color w:val="000000"/>
-        </w:rPr>
-        <w:t xml:space="preserve">            switch (choice) {</w:t>
-      </w:r>
-    </w:p>
-    <w:p>
-      <w:pPr>
-        <w:pStyle w:val="a"/>
-        <w:widowControl/>
-        <w:jc w:val="left"/>
-        <w:spacing w:before="0" w:after="0" w:line="220" w:lineRule="exact"/>
-      </w:pPr>
-      <w:r>
-        <w:rPr>
-          <w:rFonts w:ascii="Consolas" w:hAnsi="Consolas" w:cs="Times New Roman"/>
-          <w:sz w:val="20"/>
-          <w:color w:val="000000"/>
-        </w:rPr>
-        <w:t xml:space="preserve">                case 1: bmi(input); break;</w:t>
-      </w:r>
-    </w:p>
-    <w:p>
-      <w:pPr>
-        <w:pStyle w:val="a"/>
-        <w:widowControl/>
-        <w:jc w:val="left"/>
-        <w:spacing w:before="0" w:after="0" w:line="220" w:lineRule="exact"/>
-      </w:pPr>
-      <w:r>
-        <w:rPr>
-          <w:rFonts w:ascii="Consolas" w:hAnsi="Consolas" w:cs="Times New Roman"/>
-          <w:sz w:val="20"/>
-          <w:color w:val="000000"/>
-        </w:rPr>
-        <w:t xml:space="preserve">                case 2: exchange(input, false); break;</w:t>
-      </w:r>
-    </w:p>
-    <w:p>
-      <w:pPr>
-        <w:pStyle w:val="a"/>
-        <w:widowControl/>
-        <w:jc w:val="left"/>
-        <w:spacing w:before="0" w:after="0" w:line="220" w:lineRule="exact"/>
-      </w:pPr>
-      <w:r>
-        <w:rPr>
-          <w:rFonts w:ascii="Consolas" w:hAnsi="Consolas" w:cs="Times New Roman"/>
-          <w:sz w:val="20"/>
-          <w:color w:val="000000"/>
-        </w:rPr>
-        <w:t xml:space="preserve">                case 3: exchange(input, true); break;</w:t>
-      </w:r>
-    </w:p>
-    <w:p>
-      <w:pPr>
-        <w:pStyle w:val="a"/>
-        <w:widowControl/>
-        <w:jc w:val="left"/>
-        <w:spacing w:before="0" w:after="0" w:line="220" w:lineRule="exact"/>
-      </w:pPr>
-      <w:r>
-        <w:rPr>
-          <w:rFonts w:ascii="Consolas" w:hAnsi="Consolas" w:cs="Times New Roman"/>
-          <w:sz w:val="20"/>
-          <w:color w:val="000000"/>
-        </w:rPr>
-        <w:t xml:space="preserve">                case 4: cars(); break;</w:t>
-      </w:r>
-    </w:p>
-    <w:p>
-      <w:pPr>
-        <w:pStyle w:val="a"/>
-        <w:widowControl/>
-        <w:jc w:val="left"/>
-        <w:spacing w:before="0" w:after="0" w:line="220" w:lineRule="exact"/>
-      </w:pPr>
-      <w:r>
-        <w:rPr>
-          <w:rFonts w:ascii="Consolas" w:hAnsi="Consolas" w:cs="Times New Roman"/>
-          <w:sz w:val="20"/>
-          <w:color w:val="000000"/>
-        </w:rPr>
-        <w:t xml:space="preserve">                default: System.out.println("Нет такого пункта.");</w:t>
-      </w:r>
-    </w:p>
-    <w:p>
-      <w:pPr>
-        <w:pStyle w:val="a"/>
-        <w:widowControl/>
-        <w:jc w:val="left"/>
-        <w:spacing w:before="0" w:after="0" w:line="220" w:lineRule="exact"/>
-      </w:pPr>
-      <w:r>
-        <w:rPr>
-          <w:rFonts w:ascii="Consolas" w:hAnsi="Consolas" w:cs="Times New Roman"/>
-          <w:sz w:val="20"/>
-          <w:color w:val="000000"/>
-        </w:rPr>
-        <w:t xml:space="preserve">            }</w:t>
-      </w:r>
-    </w:p>
-    <w:p>
-      <w:pPr>
-        <w:pStyle w:val="a"/>
-        <w:widowControl/>
-        <w:jc w:val="left"/>
-        <w:spacing w:before="0" w:after="0" w:line="220" w:lineRule="exact"/>
-      </w:pPr>
-      <w:r>
-        <w:rPr>
-          <w:rFonts w:ascii="Consolas" w:hAnsi="Consolas" w:cs="Times New Roman"/>
-          <w:sz w:val="20"/>
-          <w:color w:val="000000"/>
-        </w:rPr>
-        <w:t xml:space="preserve">        }</w:t>
-      </w:r>
-    </w:p>
-    <w:p>
-      <w:pPr>
-        <w:pStyle w:val="a"/>
-        <w:widowControl/>
-        <w:jc w:val="left"/>
-        <w:spacing w:before="0" w:after="0" w:line="220" w:lineRule="exact"/>
-      </w:pPr>
-      <w:r>
-        <w:rPr>
-          <w:rFonts w:ascii="Consolas" w:hAnsi="Consolas" w:cs="Times New Roman"/>
-          <w:sz w:val="20"/>
-          <w:color w:val="000000"/>
-        </w:rPr>
-        <w:t xml:space="preserve">        input.close();</w:t>
-      </w:r>
-    </w:p>
-    <w:p>
-      <w:pPr>
-        <w:pStyle w:val="a"/>
-        <w:widowControl/>
-        <w:jc w:val="left"/>
-        <w:spacing w:before="0" w:after="0" w:line="220" w:lineRule="exact"/>
-      </w:pPr>
-      <w:r>
-        <w:rPr>
-          <w:rFonts w:ascii="Consolas" w:hAnsi="Consolas" w:cs="Times New Roman"/>
-          <w:sz w:val="20"/>
-          <w:color w:val="000000"/>
-        </w:rPr>
-        <w:t xml:space="preserve">    }</w:t>
-      </w:r>
-    </w:p>
-    <w:p>
-      <w:pPr>
-        <w:pStyle w:val="a"/>
-        <w:widowControl/>
-        <w:jc w:val="left"/>
-        <w:spacing w:before="0" w:after="0" w:line="220" w:lineRule="exact"/>
-      </w:pPr>
-      <w:r>
-        <w:rPr>
-          <w:rFonts w:ascii="Consolas" w:hAnsi="Consolas" w:cs="Times New Roman"/>
-          <w:sz w:val="20"/>
-          <w:color w:val="000000"/>
-        </w:rPr>
-        <w:t xml:space="preserve"/>
-      </w:r>
-    </w:p>
-    <w:p>
-      <w:pPr>
-        <w:pStyle w:val="a"/>
-        <w:widowControl/>
-        <w:jc w:val="left"/>
-        <w:spacing w:before="0" w:after="0" w:line="220" w:lineRule="exact"/>
-      </w:pPr>
-      <w:r>
-        <w:rPr>
-          <w:rFonts w:ascii="Consolas" w:hAnsi="Consolas" w:cs="Times New Roman"/>
-          <w:sz w:val="20"/>
-          <w:color w:val="000000"/>
-        </w:rPr>
-        <w:t xml:space="preserve">    static void bmi(Scanner input) {</w:t>
-      </w:r>
-    </w:p>
-    <w:p>
-      <w:pPr>
-        <w:pStyle w:val="a"/>
-        <w:widowControl/>
-        <w:jc w:val="left"/>
-        <w:spacing w:before="0" w:after="0" w:line="220" w:lineRule="exact"/>
-      </w:pPr>
-      <w:r>
-        <w:rPr>
-          <w:rFonts w:ascii="Consolas" w:hAnsi="Consolas" w:cs="Times New Roman"/>
-          <w:sz w:val="20"/>
-          <w:color w:val="000000"/>
-        </w:rPr>
-        <w:t xml:space="preserve">        System.out.print("Вес (кг): ");</w:t>
-      </w:r>
-    </w:p>
-    <w:p>
-      <w:pPr>
-        <w:pStyle w:val="a"/>
-        <w:widowControl/>
-        <w:jc w:val="left"/>
-        <w:spacing w:before="0" w:after="0" w:line="220" w:lineRule="exact"/>
-      </w:pPr>
-      <w:r>
-        <w:rPr>
-          <w:rFonts w:ascii="Consolas" w:hAnsi="Consolas" w:cs="Times New Roman"/>
-          <w:sz w:val="20"/>
-          <w:color w:val="000000"/>
-        </w:rPr>
-        <w:t xml:space="preserve">        double weight = Double.parseDouble(input.next().replace(',', '.'));</w:t>
-      </w:r>
-    </w:p>
-    <w:p>
-      <w:pPr>
-        <w:pStyle w:val="a"/>
-        <w:widowControl/>
-        <w:jc w:val="left"/>
-        <w:spacing w:before="0" w:after="0" w:line="220" w:lineRule="exact"/>
-      </w:pPr>
-      <w:r>
-        <w:rPr>
-          <w:rFonts w:ascii="Consolas" w:hAnsi="Consolas" w:cs="Times New Roman"/>
-          <w:sz w:val="20"/>
-          <w:color w:val="000000"/>
-        </w:rPr>
-        <w:t xml:space="preserve">        System.out.print("Рост (см): ");</w:t>
-      </w:r>
-    </w:p>
-    <w:p>
-      <w:pPr>
-        <w:pStyle w:val="a"/>
-        <w:widowControl/>
-        <w:jc w:val="left"/>
-        <w:spacing w:before="0" w:after="0" w:line="220" w:lineRule="exact"/>
-      </w:pPr>
-      <w:r>
-        <w:rPr>
-          <w:rFonts w:ascii="Consolas" w:hAnsi="Consolas" w:cs="Times New Roman"/>
-          <w:sz w:val="20"/>
-          <w:color w:val="000000"/>
-        </w:rPr>
-        <w:t xml:space="preserve">        double height = Double.parseDouble(input.next().replace(',', '.'));</w:t>
-      </w:r>
-    </w:p>
-    <w:p>
-      <w:pPr>
-        <w:pStyle w:val="a"/>
-        <w:widowControl/>
-        <w:jc w:val="left"/>
-        <w:spacing w:before="0" w:after="0" w:line="220" w:lineRule="exact"/>
-      </w:pPr>
-      <w:r>
-        <w:rPr>
-          <w:rFonts w:ascii="Consolas" w:hAnsi="Consolas" w:cs="Times New Roman"/>
-          <w:sz w:val="20"/>
-          <w:color w:val="000000"/>
-        </w:rPr>
-        <w:t xml:space="preserve">        if (weight &lt;= 0 || height &lt;= 0) {</w:t>
-      </w:r>
-    </w:p>
-    <w:p>
-      <w:pPr>
-        <w:pStyle w:val="a"/>
-        <w:widowControl/>
-        <w:jc w:val="left"/>
-        <w:spacing w:before="0" w:after="0" w:line="220" w:lineRule="exact"/>
-      </w:pPr>
-      <w:r>
-        <w:rPr>
-          <w:rFonts w:ascii="Consolas" w:hAnsi="Consolas" w:cs="Times New Roman"/>
-          <w:sz w:val="20"/>
-          <w:color w:val="000000"/>
-        </w:rPr>
-        <w:t xml:space="preserve">            System.out.println("Вес и рост должны быть больше нуля.");</w:t>
-      </w:r>
-    </w:p>
-    <w:p>
-      <w:pPr>
-        <w:pStyle w:val="a"/>
-        <w:widowControl/>
-        <w:jc w:val="left"/>
-        <w:spacing w:before="0" w:after="0" w:line="220" w:lineRule="exact"/>
-      </w:pPr>
-      <w:r>
-        <w:rPr>
-          <w:rFonts w:ascii="Consolas" w:hAnsi="Consolas" w:cs="Times New Roman"/>
-          <w:sz w:val="20"/>
-          <w:color w:val="000000"/>
-        </w:rPr>
-        <w:t xml:space="preserve">            return;</w:t>
-      </w:r>
-    </w:p>
-    <w:p>
-      <w:pPr>
-        <w:pStyle w:val="a"/>
-        <w:widowControl/>
-        <w:jc w:val="left"/>
-        <w:spacing w:before="0" w:after="0" w:line="220" w:lineRule="exact"/>
-      </w:pPr>
-      <w:r>
-        <w:rPr>
-          <w:rFonts w:ascii="Consolas" w:hAnsi="Consolas" w:cs="Times New Roman"/>
-          <w:sz w:val="20"/>
-          <w:color w:val="000000"/>
-        </w:rPr>
-        <w:t xml:space="preserve">        }</w:t>
-      </w:r>
-    </w:p>
-    <w:p>
-      <w:pPr>
-        <w:pStyle w:val="a"/>
-        <w:widowControl/>
-        <w:jc w:val="left"/>
-        <w:spacing w:before="0" w:after="0" w:line="220" w:lineRule="exact"/>
-      </w:pPr>
-      <w:r>
-        <w:rPr>
-          <w:rFonts w:ascii="Consolas" w:hAnsi="Consolas" w:cs="Times New Roman"/>
-          <w:sz w:val="20"/>
-          <w:color w:val="000000"/>
-        </w:rPr>
-        <w:t xml:space="preserve">        double bmi = weight / (height / 100 * height / 100);</w:t>
-      </w:r>
-    </w:p>
-    <w:p>
-      <w:pPr>
-        <w:pStyle w:val="a"/>
-        <w:widowControl/>
-        <w:jc w:val="left"/>
-        <w:spacing w:before="0" w:after="0" w:line="220" w:lineRule="exact"/>
-      </w:pPr>
-      <w:r>
-        <w:rPr>
-          <w:rFonts w:ascii="Consolas" w:hAnsi="Consolas" w:cs="Times New Roman"/>
-          <w:sz w:val="20"/>
-          <w:color w:val="000000"/>
-        </w:rPr>
-        <w:t xml:space="preserve">        System.out.printf("BMI: %.2f%n", bmi);</w:t>
-      </w:r>
-    </w:p>
-    <w:p>
-      <w:pPr>
-        <w:pStyle w:val="a"/>
-        <w:widowControl/>
-        <w:jc w:val="left"/>
-        <w:spacing w:before="0" w:after="0" w:line="220" w:lineRule="exact"/>
-      </w:pPr>
-      <w:r>
-        <w:rPr>
-          <w:rFonts w:ascii="Consolas" w:hAnsi="Consolas" w:cs="Times New Roman"/>
-          <w:sz w:val="20"/>
-          <w:color w:val="000000"/>
-        </w:rPr>
-        <w:t xml:space="preserve">        if (bmi &lt; 18.5) System.out.println("Недостаточный вес");</w:t>
-      </w:r>
-    </w:p>
-    <w:p>
-      <w:pPr>
-        <w:pStyle w:val="a"/>
-        <w:widowControl/>
-        <w:jc w:val="left"/>
-        <w:spacing w:before="0" w:after="0" w:line="220" w:lineRule="exact"/>
-      </w:pPr>
-      <w:r>
-        <w:rPr>
-          <w:rFonts w:ascii="Consolas" w:hAnsi="Consolas" w:cs="Times New Roman"/>
-          <w:sz w:val="20"/>
-          <w:color w:val="000000"/>
-        </w:rPr>
-        <w:t xml:space="preserve">        else if (bmi &lt; 25) System.out.println("Норма");</w:t>
-      </w:r>
-    </w:p>
-    <w:p>
-      <w:pPr>
-        <w:pStyle w:val="a"/>
-        <w:widowControl/>
-        <w:jc w:val="left"/>
-        <w:spacing w:before="0" w:after="0" w:line="220" w:lineRule="exact"/>
-      </w:pPr>
-      <w:r>
-        <w:rPr>
-          <w:rFonts w:ascii="Consolas" w:hAnsi="Consolas" w:cs="Times New Roman"/>
-          <w:sz w:val="20"/>
-          <w:color w:val="000000"/>
-        </w:rPr>
-        <w:t xml:space="preserve">        else if (bmi &lt; 30) System.out.println("Избыточный вес");</w:t>
-      </w:r>
-    </w:p>
-    <w:p>
-      <w:pPr>
-        <w:pStyle w:val="a"/>
-        <w:widowControl/>
-        <w:jc w:val="left"/>
-        <w:spacing w:before="0" w:after="0" w:line="220" w:lineRule="exact"/>
-      </w:pPr>
-      <w:r>
-        <w:rPr>
-          <w:rFonts w:ascii="Consolas" w:hAnsi="Consolas" w:cs="Times New Roman"/>
-          <w:sz w:val="20"/>
-          <w:color w:val="000000"/>
-        </w:rPr>
-        <w:t xml:space="preserve">        else System.out.println("Ожирение");</w:t>
-      </w:r>
-    </w:p>
-    <w:p>
-      <w:pPr>
-        <w:pStyle w:val="a"/>
-        <w:widowControl/>
-        <w:jc w:val="left"/>
-        <w:spacing w:before="0" w:after="0" w:line="220" w:lineRule="exact"/>
-      </w:pPr>
-      <w:r>
-        <w:rPr>
-          <w:rFonts w:ascii="Consolas" w:hAnsi="Consolas" w:cs="Times New Roman"/>
-          <w:sz w:val="20"/>
-          <w:color w:val="000000"/>
-        </w:rPr>
-        <w:t xml:space="preserve">    }</w:t>
-      </w:r>
-    </w:p>
-    <w:p>
-      <w:pPr>
-        <w:pStyle w:val="a"/>
-        <w:widowControl/>
-        <w:jc w:val="left"/>
-        <w:spacing w:before="0" w:after="0" w:line="220" w:lineRule="exact"/>
-      </w:pPr>
-      <w:r>
-        <w:rPr>
-          <w:rFonts w:ascii="Consolas" w:hAnsi="Consolas" w:cs="Times New Roman"/>
-          <w:sz w:val="20"/>
-          <w:color w:val="000000"/>
-        </w:rPr>
-        <w:t xml:space="preserve"/>
-      </w:r>
-    </w:p>
-    <w:p>
-      <w:pPr>
-        <w:pStyle w:val="2"/>
-        <w:ind w:firstLine="709"/>
-        <w:pageBreakBefore/>
-        <w:jc w:val="left"/>
-      </w:pPr>
-      <w:r>
-        <w:rPr>
-          <w:color w:val="000000"/>
-        </w:rPr>
-        <w:t>Продолжение кода программы</w:t>
-      </w:r>
-    </w:p>
-    <w:p>
-      <w:pPr>
-        <w:pStyle w:val="a"/>
-        <w:ind w:firstLine="709"/>
-        <w:widowControl/>
-        <w:jc w:val="both"/>
-        <w:spacing w:before="0" w:after="160" w:line="259" w:lineRule="auto"/>
-      </w:pPr>
-      <w:r>
-        <w:rPr>
-          <w:rFonts w:ascii="Times New Roman" w:hAnsi="Times New Roman" w:cs="Times New Roman"/>
-          <w:sz w:val="24"/>
-          <w:color w:val="000000"/>
-        </w:rPr>
-        <w:t xml:space="preserve">Файл Main.java строки 39–78</w:t>
-      </w:r>
-    </w:p>
-    <w:p>
-      <w:pPr>
-        <w:pStyle w:val="a"/>
-        <w:widowControl/>
-        <w:jc w:val="left"/>
-        <w:spacing w:before="0" w:after="0" w:line="220" w:lineRule="exact"/>
-      </w:pPr>
-      <w:r>
-        <w:rPr>
-          <w:rFonts w:ascii="Consolas" w:hAnsi="Consolas" w:cs="Times New Roman"/>
-          <w:sz w:val="20"/>
-          <w:color w:val="000000"/>
-        </w:rPr>
-        <w:t xml:space="preserve">    static void exchange(Scanner input, boolean withEndings) {</w:t>
-      </w:r>
-    </w:p>
-    <w:p>
-      <w:pPr>
-        <w:pStyle w:val="a"/>
-        <w:widowControl/>
-        <w:jc w:val="left"/>
-        <w:spacing w:before="0" w:after="0" w:line="220" w:lineRule="exact"/>
-      </w:pPr>
-      <w:r>
-        <w:rPr>
-          <w:rFonts w:ascii="Consolas" w:hAnsi="Consolas" w:cs="Times New Roman"/>
-          <w:sz w:val="20"/>
-          <w:color w:val="000000"/>
-        </w:rPr>
-        <w:t xml:space="preserve">        final double ROUBLES_PER_YUAN = 11.91;</w:t>
-      </w:r>
-    </w:p>
-    <w:p>
-      <w:pPr>
-        <w:pStyle w:val="a"/>
-        <w:widowControl/>
-        <w:jc w:val="left"/>
-        <w:spacing w:before="0" w:after="0" w:line="220" w:lineRule="exact"/>
-      </w:pPr>
-      <w:r>
-        <w:rPr>
-          <w:rFonts w:ascii="Consolas" w:hAnsi="Consolas" w:cs="Times New Roman"/>
-          <w:sz w:val="20"/>
-          <w:color w:val="000000"/>
-        </w:rPr>
-        <w:t xml:space="preserve">        System.out.print("Введите целое количество юаней: ");</w:t>
-      </w:r>
-    </w:p>
-    <w:p>
-      <w:pPr>
-        <w:pStyle w:val="a"/>
-        <w:widowControl/>
-        <w:jc w:val="left"/>
-        <w:spacing w:before="0" w:after="0" w:line="220" w:lineRule="exact"/>
-      </w:pPr>
-      <w:r>
-        <w:rPr>
-          <w:rFonts w:ascii="Consolas" w:hAnsi="Consolas" w:cs="Times New Roman"/>
-          <w:sz w:val="20"/>
-          <w:color w:val="000000"/>
-        </w:rPr>
-        <w:t xml:space="preserve">        int yuan = input.nextInt();</w:t>
-      </w:r>
-    </w:p>
-    <w:p>
-      <w:pPr>
-        <w:pStyle w:val="a"/>
-        <w:widowControl/>
-        <w:jc w:val="left"/>
-        <w:spacing w:before="0" w:after="0" w:line="220" w:lineRule="exact"/>
-      </w:pPr>
-      <w:r>
-        <w:rPr>
-          <w:rFonts w:ascii="Consolas" w:hAnsi="Consolas" w:cs="Times New Roman"/>
-          <w:sz w:val="20"/>
-          <w:color w:val="000000"/>
-        </w:rPr>
-        <w:t xml:space="preserve">        if (yuan &lt; 0) {</w:t>
-      </w:r>
-    </w:p>
-    <w:p>
-      <w:pPr>
-        <w:pStyle w:val="a"/>
-        <w:widowControl/>
-        <w:jc w:val="left"/>
-        <w:spacing w:before="0" w:after="0" w:line="220" w:lineRule="exact"/>
-      </w:pPr>
-      <w:r>
-        <w:rPr>
-          <w:rFonts w:ascii="Consolas" w:hAnsi="Consolas" w:cs="Times New Roman"/>
-          <w:sz w:val="20"/>
-          <w:color w:val="000000"/>
-        </w:rPr>
-        <w:t xml:space="preserve">            System.out.println("Сумма не может быть отрицательной.");</w:t>
-      </w:r>
-    </w:p>
-    <w:p>
-      <w:pPr>
-        <w:pStyle w:val="a"/>
-        <w:widowControl/>
-        <w:jc w:val="left"/>
-        <w:spacing w:before="0" w:after="0" w:line="220" w:lineRule="exact"/>
-      </w:pPr>
-      <w:r>
-        <w:rPr>
-          <w:rFonts w:ascii="Consolas" w:hAnsi="Consolas" w:cs="Times New Roman"/>
-          <w:sz w:val="20"/>
-          <w:color w:val="000000"/>
-        </w:rPr>
-        <w:t xml:space="preserve">            return;</w:t>
-      </w:r>
-    </w:p>
-    <w:p>
-      <w:pPr>
-        <w:pStyle w:val="a"/>
-        <w:widowControl/>
-        <w:jc w:val="left"/>
-        <w:spacing w:before="0" w:after="0" w:line="220" w:lineRule="exact"/>
-      </w:pPr>
-      <w:r>
-        <w:rPr>
-          <w:rFonts w:ascii="Consolas" w:hAnsi="Consolas" w:cs="Times New Roman"/>
-          <w:sz w:val="20"/>
-          <w:color w:val="000000"/>
-        </w:rPr>
-        <w:t xml:space="preserve">        }</w:t>
-      </w:r>
-    </w:p>
-    <w:p>
-      <w:pPr>
-        <w:pStyle w:val="a"/>
-        <w:widowControl/>
-        <w:jc w:val="left"/>
-        <w:spacing w:before="0" w:after="0" w:line="220" w:lineRule="exact"/>
-      </w:pPr>
-      <w:r>
-        <w:rPr>
-          <w:rFonts w:ascii="Consolas" w:hAnsi="Consolas" w:cs="Times New Roman"/>
-          <w:sz w:val="20"/>
-          <w:color w:val="000000"/>
-        </w:rPr>
-        <w:t xml:space="preserve">        double roubles = ROUBLES_PER_YUAN * yuan;</w:t>
-      </w:r>
-    </w:p>
-    <w:p>
-      <w:pPr>
-        <w:pStyle w:val="a"/>
-        <w:widowControl/>
-        <w:jc w:val="left"/>
-        <w:spacing w:before="0" w:after="0" w:line="220" w:lineRule="exact"/>
-      </w:pPr>
-      <w:r>
-        <w:rPr>
-          <w:rFonts w:ascii="Consolas" w:hAnsi="Consolas" w:cs="Times New Roman"/>
-          <w:sz w:val="20"/>
-          <w:color w:val="000000"/>
-        </w:rPr>
-        <w:t xml:space="preserve">        String word = "CNY";</w:t>
-      </w:r>
-    </w:p>
-    <w:p>
-      <w:pPr>
-        <w:pStyle w:val="a"/>
-        <w:widowControl/>
-        <w:jc w:val="left"/>
-        <w:spacing w:before="0" w:after="0" w:line="220" w:lineRule="exact"/>
-      </w:pPr>
-      <w:r>
-        <w:rPr>
-          <w:rFonts w:ascii="Consolas" w:hAnsi="Consolas" w:cs="Times New Roman"/>
-          <w:sz w:val="20"/>
-          <w:color w:val="000000"/>
-        </w:rPr>
-        <w:t xml:space="preserve">        if (withEndings) {</w:t>
-      </w:r>
-    </w:p>
-    <w:p>
-      <w:pPr>
-        <w:pStyle w:val="a"/>
-        <w:widowControl/>
-        <w:jc w:val="left"/>
-        <w:spacing w:before="0" w:after="0" w:line="220" w:lineRule="exact"/>
-      </w:pPr>
-      <w:r>
-        <w:rPr>
-          <w:rFonts w:ascii="Consolas" w:hAnsi="Consolas" w:cs="Times New Roman"/>
-          <w:sz w:val="20"/>
-          <w:color w:val="000000"/>
-        </w:rPr>
-        <w:t xml:space="preserve">            int digit = yuan % 10;</w:t>
-      </w:r>
-    </w:p>
-    <w:p>
-      <w:pPr>
-        <w:pStyle w:val="a"/>
-        <w:widowControl/>
-        <w:jc w:val="left"/>
-        <w:spacing w:before="0" w:after="0" w:line="220" w:lineRule="exact"/>
-      </w:pPr>
-      <w:r>
-        <w:rPr>
-          <w:rFonts w:ascii="Consolas" w:hAnsi="Consolas" w:cs="Times New Roman"/>
-          <w:sz w:val="20"/>
-          <w:color w:val="000000"/>
-        </w:rPr>
-        <w:t xml:space="preserve">            int lastTwo = yuan % 100;</w:t>
-      </w:r>
-    </w:p>
-    <w:p>
-      <w:pPr>
-        <w:pStyle w:val="a"/>
-        <w:widowControl/>
-        <w:jc w:val="left"/>
-        <w:spacing w:before="0" w:after="0" w:line="220" w:lineRule="exact"/>
-      </w:pPr>
-      <w:r>
-        <w:rPr>
-          <w:rFonts w:ascii="Consolas" w:hAnsi="Consolas" w:cs="Times New Roman"/>
-          <w:sz w:val="20"/>
-          <w:color w:val="000000"/>
-        </w:rPr>
-        <w:t xml:space="preserve">            if (lastTwo &gt;= 11 &amp;&amp; lastTwo &lt;= 14) word = "китайских юаней";</w:t>
-      </w:r>
-    </w:p>
-    <w:p>
-      <w:pPr>
-        <w:pStyle w:val="a"/>
-        <w:widowControl/>
-        <w:jc w:val="left"/>
-        <w:spacing w:before="0" w:after="0" w:line="220" w:lineRule="exact"/>
-      </w:pPr>
-      <w:r>
-        <w:rPr>
-          <w:rFonts w:ascii="Consolas" w:hAnsi="Consolas" w:cs="Times New Roman"/>
-          <w:sz w:val="20"/>
-          <w:color w:val="000000"/>
-        </w:rPr>
-        <w:t xml:space="preserve">            else if (digit == 1) word = "китайский юань";</w:t>
-      </w:r>
-    </w:p>
-    <w:p>
-      <w:pPr>
-        <w:pStyle w:val="a"/>
-        <w:widowControl/>
-        <w:jc w:val="left"/>
-        <w:spacing w:before="0" w:after="0" w:line="220" w:lineRule="exact"/>
-      </w:pPr>
-      <w:r>
-        <w:rPr>
-          <w:rFonts w:ascii="Consolas" w:hAnsi="Consolas" w:cs="Times New Roman"/>
-          <w:sz w:val="20"/>
-          <w:color w:val="000000"/>
-        </w:rPr>
-        <w:t xml:space="preserve">            else if (digit &gt;= 2 &amp;&amp; digit &lt;= 4) word = "китайских юаня";</w:t>
-      </w:r>
-    </w:p>
-    <w:p>
-      <w:pPr>
-        <w:pStyle w:val="a"/>
-        <w:widowControl/>
-        <w:jc w:val="left"/>
-        <w:spacing w:before="0" w:after="0" w:line="220" w:lineRule="exact"/>
-      </w:pPr>
-      <w:r>
-        <w:rPr>
-          <w:rFonts w:ascii="Consolas" w:hAnsi="Consolas" w:cs="Times New Roman"/>
-          <w:sz w:val="20"/>
-          <w:color w:val="000000"/>
-        </w:rPr>
-        <w:t xml:space="preserve">            else word = "китайских юаней";</w:t>
-      </w:r>
-    </w:p>
-    <w:p>
-      <w:pPr>
-        <w:pStyle w:val="a"/>
-        <w:widowControl/>
-        <w:jc w:val="left"/>
-        <w:spacing w:before="0" w:after="0" w:line="220" w:lineRule="exact"/>
-      </w:pPr>
-      <w:r>
-        <w:rPr>
-          <w:rFonts w:ascii="Consolas" w:hAnsi="Consolas" w:cs="Times New Roman"/>
-          <w:sz w:val="20"/>
-          <w:color w:val="000000"/>
-        </w:rPr>
-        <w:t xml:space="preserve">        }</w:t>
-      </w:r>
-    </w:p>
-    <w:p>
-      <w:pPr>
-        <w:pStyle w:val="a"/>
-        <w:widowControl/>
-        <w:jc w:val="left"/>
-        <w:spacing w:before="0" w:after="0" w:line="220" w:lineRule="exact"/>
-      </w:pPr>
-      <w:r>
-        <w:rPr>
-          <w:rFonts w:ascii="Consolas" w:hAnsi="Consolas" w:cs="Times New Roman"/>
-          <w:sz w:val="20"/>
-          <w:color w:val="000000"/>
-        </w:rPr>
-        <w:t xml:space="preserve">        System.out.printf("%d %s = %.2f руб.%n", yuan, word, roubles);</w:t>
-      </w:r>
-    </w:p>
-    <w:p>
-      <w:pPr>
-        <w:pStyle w:val="a"/>
-        <w:widowControl/>
-        <w:jc w:val="left"/>
-        <w:spacing w:before="0" w:after="0" w:line="220" w:lineRule="exact"/>
-      </w:pPr>
-      <w:r>
-        <w:rPr>
-          <w:rFonts w:ascii="Consolas" w:hAnsi="Consolas" w:cs="Times New Roman"/>
-          <w:sz w:val="20"/>
-          <w:color w:val="000000"/>
-        </w:rPr>
-        <w:t xml:space="preserve">    }</w:t>
-      </w:r>
-    </w:p>
-    <w:p>
-      <w:pPr>
-        <w:pStyle w:val="a"/>
-        <w:widowControl/>
-        <w:jc w:val="left"/>
-        <w:spacing w:before="0" w:after="0" w:line="220" w:lineRule="exact"/>
-      </w:pPr>
-      <w:r>
-        <w:rPr>
-          <w:rFonts w:ascii="Consolas" w:hAnsi="Consolas" w:cs="Times New Roman"/>
-          <w:sz w:val="20"/>
-          <w:color w:val="000000"/>
-        </w:rPr>
-        <w:t xml:space="preserve"/>
-      </w:r>
-    </w:p>
-    <w:p>
-      <w:pPr>
-        <w:pStyle w:val="a"/>
-        <w:widowControl/>
-        <w:jc w:val="left"/>
-        <w:spacing w:before="0" w:after="0" w:line="220" w:lineRule="exact"/>
-      </w:pPr>
-      <w:r>
-        <w:rPr>
-          <w:rFonts w:ascii="Consolas" w:hAnsi="Consolas" w:cs="Times New Roman"/>
-          <w:sz w:val="20"/>
-          <w:color w:val="000000"/>
-        </w:rPr>
-        <w:t xml:space="preserve">    static void cars() {</w:t>
-      </w:r>
-    </w:p>
-    <w:p>
-      <w:pPr>
-        <w:pStyle w:val="a"/>
-        <w:widowControl/>
-        <w:jc w:val="left"/>
-        <w:spacing w:before="0" w:after="0" w:line="220" w:lineRule="exact"/>
-      </w:pPr>
-      <w:r>
-        <w:rPr>
-          <w:rFonts w:ascii="Consolas" w:hAnsi="Consolas" w:cs="Times New Roman"/>
-          <w:sz w:val="20"/>
-          <w:color w:val="000000"/>
-        </w:rPr>
-        <w:t xml:space="preserve">        Car first = new Car();</w:t>
-      </w:r>
-    </w:p>
-    <w:p>
-      <w:pPr>
-        <w:pStyle w:val="a"/>
-        <w:widowControl/>
-        <w:jc w:val="left"/>
-        <w:spacing w:before="0" w:after="0" w:line="220" w:lineRule="exact"/>
-      </w:pPr>
-      <w:r>
-        <w:rPr>
-          <w:rFonts w:ascii="Consolas" w:hAnsi="Consolas" w:cs="Times New Roman"/>
-          <w:sz w:val="20"/>
-          <w:color w:val="000000"/>
-        </w:rPr>
-        <w:t xml:space="preserve">        Car second = new Car("Toyota Camry", "А123ВС77", "Чёрный", 2020);</w:t>
-      </w:r>
-    </w:p>
-    <w:p>
-      <w:pPr>
-        <w:pStyle w:val="a"/>
-        <w:widowControl/>
-        <w:jc w:val="left"/>
-        <w:spacing w:before="0" w:after="0" w:line="220" w:lineRule="exact"/>
-      </w:pPr>
-      <w:r>
-        <w:rPr>
-          <w:rFonts w:ascii="Consolas" w:hAnsi="Consolas" w:cs="Times New Roman"/>
-          <w:sz w:val="20"/>
-          <w:color w:val="000000"/>
-        </w:rPr>
-        <w:t xml:space="preserve">        Car third = new Car("Lada Vesta", 2022);</w:t>
-      </w:r>
-    </w:p>
-    <w:p>
-      <w:pPr>
-        <w:pStyle w:val="a"/>
-        <w:widowControl/>
-        <w:jc w:val="left"/>
-        <w:spacing w:before="0" w:after="0" w:line="220" w:lineRule="exact"/>
-      </w:pPr>
-      <w:r>
-        <w:rPr>
-          <w:rFonts w:ascii="Consolas" w:hAnsi="Consolas" w:cs="Times New Roman"/>
-          <w:sz w:val="20"/>
-          <w:color w:val="000000"/>
-        </w:rPr>
-        <w:t xml:space="preserve">        first.To_String();</w:t>
-      </w:r>
-    </w:p>
-    <w:p>
-      <w:pPr>
-        <w:pStyle w:val="a"/>
-        <w:widowControl/>
-        <w:jc w:val="left"/>
-        <w:spacing w:before="0" w:after="0" w:line="220" w:lineRule="exact"/>
-      </w:pPr>
-      <w:r>
-        <w:rPr>
-          <w:rFonts w:ascii="Consolas" w:hAnsi="Consolas" w:cs="Times New Roman"/>
-          <w:sz w:val="20"/>
-          <w:color w:val="000000"/>
-        </w:rPr>
-        <w:t xml:space="preserve">        second.To_String();</w:t>
-      </w:r>
-    </w:p>
-    <w:p>
-      <w:pPr>
-        <w:pStyle w:val="a"/>
-        <w:widowControl/>
-        <w:jc w:val="left"/>
-        <w:spacing w:before="0" w:after="0" w:line="220" w:lineRule="exact"/>
-      </w:pPr>
-      <w:r>
-        <w:rPr>
-          <w:rFonts w:ascii="Consolas" w:hAnsi="Consolas" w:cs="Times New Roman"/>
-          <w:sz w:val="20"/>
-          <w:color w:val="000000"/>
-        </w:rPr>
-        <w:t xml:space="preserve">        third.To_String();</w:t>
-      </w:r>
-    </w:p>
-    <w:p>
-      <w:pPr>
-        <w:pStyle w:val="a"/>
-        <w:widowControl/>
-        <w:jc w:val="left"/>
-        <w:spacing w:before="0" w:after="0" w:line="220" w:lineRule="exact"/>
-      </w:pPr>
-      <w:r>
-        <w:rPr>
-          <w:rFonts w:ascii="Consolas" w:hAnsi="Consolas" w:cs="Times New Roman"/>
-          <w:sz w:val="20"/>
-          <w:color w:val="000000"/>
-        </w:rPr>
-        <w:t xml:space="preserve"/>
-      </w:r>
-    </w:p>
-    <w:p>
-      <w:pPr>
-        <w:pStyle w:val="a"/>
-        <w:widowControl/>
-        <w:jc w:val="left"/>
-        <w:spacing w:before="0" w:after="0" w:line="220" w:lineRule="exact"/>
-      </w:pPr>
-      <w:r>
-        <w:rPr>
-          <w:rFonts w:ascii="Consolas" w:hAnsi="Consolas" w:cs="Times New Roman"/>
-          <w:sz w:val="20"/>
-          <w:color w:val="000000"/>
-        </w:rPr>
-        <w:t xml:space="preserve">        first.setModel("Kia Rio");</w:t>
-      </w:r>
-    </w:p>
-    <w:p>
-      <w:pPr>
-        <w:pStyle w:val="a"/>
-        <w:widowControl/>
-        <w:jc w:val="left"/>
-        <w:spacing w:before="0" w:after="0" w:line="220" w:lineRule="exact"/>
-      </w:pPr>
-      <w:r>
-        <w:rPr>
-          <w:rFonts w:ascii="Consolas" w:hAnsi="Consolas" w:cs="Times New Roman"/>
-          <w:sz w:val="20"/>
-          <w:color w:val="000000"/>
-        </w:rPr>
-        <w:t xml:space="preserve">        first.setLicense("М456ОР77");</w:t>
-      </w:r>
-    </w:p>
-    <w:p>
-      <w:pPr>
-        <w:pStyle w:val="a"/>
-        <w:widowControl/>
-        <w:jc w:val="left"/>
-        <w:spacing w:before="0" w:after="0" w:line="220" w:lineRule="exact"/>
-      </w:pPr>
-      <w:r>
-        <w:rPr>
-          <w:rFonts w:ascii="Consolas" w:hAnsi="Consolas" w:cs="Times New Roman"/>
-          <w:sz w:val="20"/>
-          <w:color w:val="000000"/>
-        </w:rPr>
-        <w:t xml:space="preserve">        first.setColor("Белый");</w:t>
-      </w:r>
-    </w:p>
-    <w:p>
-      <w:pPr>
-        <w:pStyle w:val="a"/>
-        <w:widowControl/>
-        <w:jc w:val="left"/>
-        <w:spacing w:before="0" w:after="0" w:line="220" w:lineRule="exact"/>
-      </w:pPr>
-      <w:r>
-        <w:rPr>
-          <w:rFonts w:ascii="Consolas" w:hAnsi="Consolas" w:cs="Times New Roman"/>
-          <w:sz w:val="20"/>
-          <w:color w:val="000000"/>
-        </w:rPr>
-        <w:t xml:space="preserve">        first.setYear(2021);</w:t>
-      </w:r>
-    </w:p>
-    <w:p>
-      <w:pPr>
-        <w:pStyle w:val="a"/>
-        <w:widowControl/>
-        <w:jc w:val="left"/>
-        <w:spacing w:before="0" w:after="0" w:line="220" w:lineRule="exact"/>
-      </w:pPr>
-      <w:r>
-        <w:rPr>
-          <w:rFonts w:ascii="Consolas" w:hAnsi="Consolas" w:cs="Times New Roman"/>
-          <w:sz w:val="20"/>
-          <w:color w:val="000000"/>
-        </w:rPr>
-        <w:t xml:space="preserve">        System.out.println("После изменения:");</w:t>
-      </w:r>
-    </w:p>
-    <w:p>
-      <w:pPr>
-        <w:pStyle w:val="a"/>
-        <w:widowControl/>
-        <w:jc w:val="left"/>
-        <w:spacing w:before="0" w:after="0" w:line="220" w:lineRule="exact"/>
-      </w:pPr>
-      <w:r>
-        <w:rPr>
-          <w:rFonts w:ascii="Consolas" w:hAnsi="Consolas" w:cs="Times New Roman"/>
-          <w:sz w:val="20"/>
-          <w:color w:val="000000"/>
-        </w:rPr>
-        <w:t xml:space="preserve">        System.out.println(first.getModel() + ", " + first.getLicense()</w:t>
-      </w:r>
-    </w:p>
-    <w:p>
-      <w:pPr>
-        <w:pStyle w:val="a"/>
-        <w:widowControl/>
-        <w:jc w:val="left"/>
-        <w:spacing w:before="0" w:after="0" w:line="220" w:lineRule="exact"/>
-      </w:pPr>
-      <w:r>
-        <w:rPr>
-          <w:rFonts w:ascii="Consolas" w:hAnsi="Consolas" w:cs="Times New Roman"/>
-          <w:sz w:val="20"/>
-          <w:color w:val="000000"/>
-        </w:rPr>
-        <w:t xml:space="preserve">                + ", " + first.getColor() + ", " + first.getYear());</w:t>
-      </w:r>
-    </w:p>
-    <w:p>
-      <w:pPr>
-        <w:pStyle w:val="a"/>
-        <w:widowControl/>
-        <w:jc w:val="left"/>
-        <w:spacing w:before="0" w:after="0" w:line="220" w:lineRule="exact"/>
-      </w:pPr>
-      <w:r>
-        <w:rPr>
-          <w:rFonts w:ascii="Consolas" w:hAnsi="Consolas" w:cs="Times New Roman"/>
-          <w:sz w:val="20"/>
-          <w:color w:val="000000"/>
-        </w:rPr>
-        <w:t xml:space="preserve">        System.out.println("Возраст автомобиля: " + first.getAge());</w:t>
-      </w:r>
-    </w:p>
-    <w:p>
-      <w:pPr>
-        <w:pStyle w:val="a"/>
-        <w:widowControl/>
-        <w:jc w:val="left"/>
-        <w:spacing w:before="0" w:after="0" w:line="220" w:lineRule="exact"/>
-      </w:pPr>
-      <w:r>
-        <w:rPr>
-          <w:rFonts w:ascii="Consolas" w:hAnsi="Consolas" w:cs="Times New Roman"/>
-          <w:sz w:val="20"/>
-          <w:color w:val="000000"/>
-        </w:rPr>
-        <w:t xml:space="preserve">    }</w:t>
-      </w:r>
-    </w:p>
-    <w:p>
-      <w:pPr>
-        <w:pStyle w:val="a"/>
-        <w:widowControl/>
-        <w:jc w:val="left"/>
-        <w:spacing w:before="0" w:after="0" w:line="220" w:lineRule="exact"/>
-      </w:pPr>
-      <w:r>
-        <w:rPr>
-          <w:rFonts w:ascii="Consolas" w:hAnsi="Consolas" w:cs="Times New Roman"/>
-          <w:sz w:val="20"/>
-          <w:color w:val="000000"/>
-        </w:rPr>
-        <w:t xml:space="preserve">}</w:t>
-      </w:r>
-    </w:p>
-    <w:p>
-      <w:pPr>
-        <w:pStyle w:val="a"/>
-        <w:widowControl/>
-        <w:jc w:val="left"/>
-        <w:spacing w:before="0" w:after="0" w:line="220" w:lineRule="exact"/>
-      </w:pPr>
-      <w:r>
-        <w:rPr>
-          <w:rFonts w:ascii="Consolas" w:hAnsi="Consolas" w:cs="Times New Roman"/>
-          <w:sz w:val="20"/>
-          <w:color w:val="000000"/>
-        </w:rPr>
-        <w:t xml:space="preserve"/>
-      </w:r>
-    </w:p>
-    <w:p>
-      <w:pPr>
-        <w:pStyle w:val="2"/>
-        <w:ind w:firstLine="709"/>
-        <w:pageBreakBefore/>
-        <w:jc w:val="left"/>
-      </w:pPr>
-      <w:r>
-        <w:rPr>
-          <w:color w:val="000000"/>
-        </w:rPr>
-        <w:t>Продолжение кода программы</w:t>
-      </w:r>
-    </w:p>
-    <w:p>
-      <w:pPr>
-        <w:pStyle w:val="a"/>
-        <w:ind w:firstLine="709"/>
-        <w:widowControl/>
-        <w:jc w:val="both"/>
-        <w:spacing w:before="0" w:after="160" w:line="259" w:lineRule="auto"/>
-      </w:pPr>
-      <w:r>
-        <w:rPr>
-          <w:rFonts w:ascii="Times New Roman" w:hAnsi="Times New Roman" w:cs="Times New Roman"/>
-          <w:sz w:val="24"/>
-          <w:color w:val="000000"/>
-        </w:rPr>
-        <w:t xml:space="preserve">Файл Main.java строки 79–116</w:t>
-      </w:r>
-    </w:p>
-    <w:p>
-      <w:pPr>
-        <w:pStyle w:val="a"/>
-        <w:widowControl/>
-        <w:jc w:val="left"/>
-        <w:spacing w:before="0" w:after="0" w:line="220" w:lineRule="exact"/>
-      </w:pPr>
-      <w:r>
-        <w:rPr>
-          <w:rFonts w:ascii="Consolas" w:hAnsi="Consolas" w:cs="Times New Roman"/>
-          <w:sz w:val="20"/>
-          <w:color w:val="000000"/>
-        </w:rPr>
-        <w:t xml:space="preserve">class Car {</w:t>
-      </w:r>
-    </w:p>
-    <w:p>
-      <w:pPr>
-        <w:pStyle w:val="a"/>
-        <w:widowControl/>
-        <w:jc w:val="left"/>
-        <w:spacing w:before="0" w:after="0" w:line="220" w:lineRule="exact"/>
-      </w:pPr>
-      <w:r>
-        <w:rPr>
-          <w:rFonts w:ascii="Consolas" w:hAnsi="Consolas" w:cs="Times New Roman"/>
-          <w:sz w:val="20"/>
-          <w:color w:val="000000"/>
-        </w:rPr>
-        <w:t xml:space="preserve">    private String model;</w:t>
-      </w:r>
-    </w:p>
-    <w:p>
-      <w:pPr>
-        <w:pStyle w:val="a"/>
-        <w:widowControl/>
-        <w:jc w:val="left"/>
-        <w:spacing w:before="0" w:after="0" w:line="220" w:lineRule="exact"/>
-      </w:pPr>
-      <w:r>
-        <w:rPr>
-          <w:rFonts w:ascii="Consolas" w:hAnsi="Consolas" w:cs="Times New Roman"/>
-          <w:sz w:val="20"/>
-          <w:color w:val="000000"/>
-        </w:rPr>
-        <w:t xml:space="preserve">    private String license;</w:t>
-      </w:r>
-    </w:p>
-    <w:p>
-      <w:pPr>
-        <w:pStyle w:val="a"/>
-        <w:widowControl/>
-        <w:jc w:val="left"/>
-        <w:spacing w:before="0" w:after="0" w:line="220" w:lineRule="exact"/>
-      </w:pPr>
-      <w:r>
-        <w:rPr>
-          <w:rFonts w:ascii="Consolas" w:hAnsi="Consolas" w:cs="Times New Roman"/>
-          <w:sz w:val="20"/>
-          <w:color w:val="000000"/>
-        </w:rPr>
-        <w:t xml:space="preserve">    private String color;</w:t>
-      </w:r>
-    </w:p>
-    <w:p>
-      <w:pPr>
-        <w:pStyle w:val="a"/>
-        <w:widowControl/>
-        <w:jc w:val="left"/>
-        <w:spacing w:before="0" w:after="0" w:line="220" w:lineRule="exact"/>
-      </w:pPr>
-      <w:r>
-        <w:rPr>
-          <w:rFonts w:ascii="Consolas" w:hAnsi="Consolas" w:cs="Times New Roman"/>
-          <w:sz w:val="20"/>
-          <w:color w:val="000000"/>
-        </w:rPr>
-        <w:t xml:space="preserve">    private int year;</w:t>
-      </w:r>
-    </w:p>
-    <w:p>
-      <w:pPr>
-        <w:pStyle w:val="a"/>
-        <w:widowControl/>
-        <w:jc w:val="left"/>
-        <w:spacing w:before="0" w:after="0" w:line="220" w:lineRule="exact"/>
-      </w:pPr>
-      <w:r>
-        <w:rPr>
-          <w:rFonts w:ascii="Consolas" w:hAnsi="Consolas" w:cs="Times New Roman"/>
-          <w:sz w:val="20"/>
-          <w:color w:val="000000"/>
-        </w:rPr>
-        <w:t xml:space="preserve"/>
-      </w:r>
-    </w:p>
-    <w:p>
-      <w:pPr>
-        <w:pStyle w:val="a"/>
-        <w:widowControl/>
-        <w:jc w:val="left"/>
-        <w:spacing w:before="0" w:after="0" w:line="220" w:lineRule="exact"/>
-      </w:pPr>
-      <w:r>
-        <w:rPr>
-          <w:rFonts w:ascii="Consolas" w:hAnsi="Consolas" w:cs="Times New Roman"/>
-          <w:sz w:val="20"/>
-          <w:color w:val="000000"/>
-        </w:rPr>
-        <w:t xml:space="preserve">    public Car() {</w:t>
-      </w:r>
-    </w:p>
-    <w:p>
-      <w:pPr>
-        <w:pStyle w:val="a"/>
-        <w:widowControl/>
-        <w:jc w:val="left"/>
-        <w:spacing w:before="0" w:after="0" w:line="220" w:lineRule="exact"/>
-      </w:pPr>
-      <w:r>
-        <w:rPr>
-          <w:rFonts w:ascii="Consolas" w:hAnsi="Consolas" w:cs="Times New Roman"/>
-          <w:sz w:val="20"/>
-          <w:color w:val="000000"/>
-        </w:rPr>
-        <w:t xml:space="preserve">        this("Не указана", "Не указан", "Не указан", Year.now().getValue());</w:t>
-      </w:r>
-    </w:p>
-    <w:p>
-      <w:pPr>
-        <w:pStyle w:val="a"/>
-        <w:widowControl/>
-        <w:jc w:val="left"/>
-        <w:spacing w:before="0" w:after="0" w:line="220" w:lineRule="exact"/>
-      </w:pPr>
-      <w:r>
-        <w:rPr>
-          <w:rFonts w:ascii="Consolas" w:hAnsi="Consolas" w:cs="Times New Roman"/>
-          <w:sz w:val="20"/>
-          <w:color w:val="000000"/>
-        </w:rPr>
-        <w:t xml:space="preserve">    }</w:t>
-      </w:r>
-    </w:p>
-    <w:p>
-      <w:pPr>
-        <w:pStyle w:val="a"/>
-        <w:widowControl/>
-        <w:jc w:val="left"/>
-        <w:spacing w:before="0" w:after="0" w:line="220" w:lineRule="exact"/>
-      </w:pPr>
-      <w:r>
-        <w:rPr>
-          <w:rFonts w:ascii="Consolas" w:hAnsi="Consolas" w:cs="Times New Roman"/>
-          <w:sz w:val="20"/>
-          <w:color w:val="000000"/>
-        </w:rPr>
-        <w:t xml:space="preserve"/>
-      </w:r>
-    </w:p>
-    <w:p>
-      <w:pPr>
-        <w:pStyle w:val="a"/>
-        <w:widowControl/>
-        <w:jc w:val="left"/>
-        <w:spacing w:before="0" w:after="0" w:line="220" w:lineRule="exact"/>
-      </w:pPr>
-      <w:r>
-        <w:rPr>
-          <w:rFonts w:ascii="Consolas" w:hAnsi="Consolas" w:cs="Times New Roman"/>
-          <w:sz w:val="20"/>
-          <w:color w:val="000000"/>
-        </w:rPr>
-        <w:t xml:space="preserve">    public Car(String model, String license, String color, int year) {</w:t>
-      </w:r>
-    </w:p>
-    <w:p>
-      <w:pPr>
-        <w:pStyle w:val="a"/>
-        <w:widowControl/>
-        <w:jc w:val="left"/>
-        <w:spacing w:before="0" w:after="0" w:line="220" w:lineRule="exact"/>
-      </w:pPr>
-      <w:r>
-        <w:rPr>
-          <w:rFonts w:ascii="Consolas" w:hAnsi="Consolas" w:cs="Times New Roman"/>
-          <w:sz w:val="20"/>
-          <w:color w:val="000000"/>
-        </w:rPr>
-        <w:t xml:space="preserve">        this.model = model;</w:t>
-      </w:r>
-    </w:p>
-    <w:p>
-      <w:pPr>
-        <w:pStyle w:val="a"/>
-        <w:widowControl/>
-        <w:jc w:val="left"/>
-        <w:spacing w:before="0" w:after="0" w:line="220" w:lineRule="exact"/>
-      </w:pPr>
-      <w:r>
-        <w:rPr>
-          <w:rFonts w:ascii="Consolas" w:hAnsi="Consolas" w:cs="Times New Roman"/>
-          <w:sz w:val="20"/>
-          <w:color w:val="000000"/>
-        </w:rPr>
-        <w:t xml:space="preserve">        this.license = license;</w:t>
-      </w:r>
-    </w:p>
-    <w:p>
-      <w:pPr>
-        <w:pStyle w:val="a"/>
-        <w:widowControl/>
-        <w:jc w:val="left"/>
-        <w:spacing w:before="0" w:after="0" w:line="220" w:lineRule="exact"/>
-      </w:pPr>
-      <w:r>
-        <w:rPr>
-          <w:rFonts w:ascii="Consolas" w:hAnsi="Consolas" w:cs="Times New Roman"/>
-          <w:sz w:val="20"/>
-          <w:color w:val="000000"/>
-        </w:rPr>
-        <w:t xml:space="preserve">        this.color = color;</w:t>
-      </w:r>
-    </w:p>
-    <w:p>
-      <w:pPr>
-        <w:pStyle w:val="a"/>
-        <w:widowControl/>
-        <w:jc w:val="left"/>
-        <w:spacing w:before="0" w:after="0" w:line="220" w:lineRule="exact"/>
-      </w:pPr>
-      <w:r>
-        <w:rPr>
-          <w:rFonts w:ascii="Consolas" w:hAnsi="Consolas" w:cs="Times New Roman"/>
-          <w:sz w:val="20"/>
-          <w:color w:val="000000"/>
-        </w:rPr>
-        <w:t xml:space="preserve">        this.year = year;</w:t>
-      </w:r>
-    </w:p>
-    <w:p>
-      <w:pPr>
-        <w:pStyle w:val="a"/>
-        <w:widowControl/>
-        <w:jc w:val="left"/>
-        <w:spacing w:before="0" w:after="0" w:line="220" w:lineRule="exact"/>
-      </w:pPr>
-      <w:r>
-        <w:rPr>
-          <w:rFonts w:ascii="Consolas" w:hAnsi="Consolas" w:cs="Times New Roman"/>
-          <w:sz w:val="20"/>
-          <w:color w:val="000000"/>
-        </w:rPr>
-        <w:t xml:space="preserve">    }</w:t>
-      </w:r>
-    </w:p>
-    <w:p>
-      <w:pPr>
-        <w:pStyle w:val="a"/>
-        <w:widowControl/>
-        <w:jc w:val="left"/>
-        <w:spacing w:before="0" w:after="0" w:line="220" w:lineRule="exact"/>
-      </w:pPr>
-      <w:r>
-        <w:rPr>
-          <w:rFonts w:ascii="Consolas" w:hAnsi="Consolas" w:cs="Times New Roman"/>
-          <w:sz w:val="20"/>
-          <w:color w:val="000000"/>
-        </w:rPr>
-        <w:t xml:space="preserve"/>
-      </w:r>
-    </w:p>
-    <w:p>
-      <w:pPr>
-        <w:pStyle w:val="a"/>
-        <w:widowControl/>
-        <w:jc w:val="left"/>
-        <w:spacing w:before="0" w:after="0" w:line="220" w:lineRule="exact"/>
-      </w:pPr>
-      <w:r>
-        <w:rPr>
-          <w:rFonts w:ascii="Consolas" w:hAnsi="Consolas" w:cs="Times New Roman"/>
-          <w:sz w:val="20"/>
-          <w:color w:val="000000"/>
-        </w:rPr>
-        <w:t xml:space="preserve">    public Car(String model, int year) {</w:t>
-      </w:r>
-    </w:p>
-    <w:p>
-      <w:pPr>
-        <w:pStyle w:val="a"/>
-        <w:widowControl/>
-        <w:jc w:val="left"/>
-        <w:spacing w:before="0" w:after="0" w:line="220" w:lineRule="exact"/>
-      </w:pPr>
-      <w:r>
-        <w:rPr>
-          <w:rFonts w:ascii="Consolas" w:hAnsi="Consolas" w:cs="Times New Roman"/>
-          <w:sz w:val="20"/>
-          <w:color w:val="000000"/>
-        </w:rPr>
-        <w:t xml:space="preserve">        this(model, "Не указан", "Не указан", year);</w:t>
-      </w:r>
-    </w:p>
-    <w:p>
-      <w:pPr>
-        <w:pStyle w:val="a"/>
-        <w:widowControl/>
-        <w:jc w:val="left"/>
-        <w:spacing w:before="0" w:after="0" w:line="220" w:lineRule="exact"/>
-      </w:pPr>
-      <w:r>
-        <w:rPr>
-          <w:rFonts w:ascii="Consolas" w:hAnsi="Consolas" w:cs="Times New Roman"/>
-          <w:sz w:val="20"/>
-          <w:color w:val="000000"/>
-        </w:rPr>
-        <w:t xml:space="preserve">    }</w:t>
-      </w:r>
-    </w:p>
-    <w:p>
-      <w:pPr>
-        <w:pStyle w:val="a"/>
-        <w:widowControl/>
-        <w:jc w:val="left"/>
-        <w:spacing w:before="0" w:after="0" w:line="220" w:lineRule="exact"/>
-      </w:pPr>
-      <w:r>
-        <w:rPr>
-          <w:rFonts w:ascii="Consolas" w:hAnsi="Consolas" w:cs="Times New Roman"/>
-          <w:sz w:val="20"/>
-          <w:color w:val="000000"/>
-        </w:rPr>
-        <w:t xml:space="preserve"/>
-      </w:r>
-    </w:p>
-    <w:p>
-      <w:pPr>
-        <w:pStyle w:val="a"/>
-        <w:widowControl/>
-        <w:jc w:val="left"/>
-        <w:spacing w:before="0" w:after="0" w:line="220" w:lineRule="exact"/>
-      </w:pPr>
-      <w:r>
-        <w:rPr>
-          <w:rFonts w:ascii="Consolas" w:hAnsi="Consolas" w:cs="Times New Roman"/>
-          <w:sz w:val="20"/>
-          <w:color w:val="000000"/>
-        </w:rPr>
-        <w:t xml:space="preserve">    public String getModel() { return model; }</w:t>
-      </w:r>
-    </w:p>
-    <w:p>
-      <w:pPr>
-        <w:pStyle w:val="a"/>
-        <w:widowControl/>
-        <w:jc w:val="left"/>
-        <w:spacing w:before="0" w:after="0" w:line="220" w:lineRule="exact"/>
-      </w:pPr>
-      <w:r>
-        <w:rPr>
-          <w:rFonts w:ascii="Consolas" w:hAnsi="Consolas" w:cs="Times New Roman"/>
-          <w:sz w:val="20"/>
-          <w:color w:val="000000"/>
-        </w:rPr>
-        <w:t xml:space="preserve">    public void setModel(String model) { this.model = model; }</w:t>
-      </w:r>
-    </w:p>
-    <w:p>
-      <w:pPr>
-        <w:pStyle w:val="a"/>
-        <w:widowControl/>
-        <w:jc w:val="left"/>
-        <w:spacing w:before="0" w:after="0" w:line="220" w:lineRule="exact"/>
-      </w:pPr>
-      <w:r>
-        <w:rPr>
-          <w:rFonts w:ascii="Consolas" w:hAnsi="Consolas" w:cs="Times New Roman"/>
-          <w:sz w:val="20"/>
-          <w:color w:val="000000"/>
-        </w:rPr>
-        <w:t xml:space="preserve">    public String getLicense() { return license; }</w:t>
-      </w:r>
-    </w:p>
-    <w:p>
-      <w:pPr>
-        <w:pStyle w:val="a"/>
-        <w:widowControl/>
-        <w:jc w:val="left"/>
-        <w:spacing w:before="0" w:after="0" w:line="220" w:lineRule="exact"/>
-      </w:pPr>
-      <w:r>
-        <w:rPr>
-          <w:rFonts w:ascii="Consolas" w:hAnsi="Consolas" w:cs="Times New Roman"/>
-          <w:sz w:val="20"/>
-          <w:color w:val="000000"/>
-        </w:rPr>
-        <w:t xml:space="preserve">    public void setLicense(String license) { this.license = license; }</w:t>
-      </w:r>
-    </w:p>
-    <w:p>
-      <w:pPr>
-        <w:pStyle w:val="a"/>
-        <w:widowControl/>
-        <w:jc w:val="left"/>
-        <w:spacing w:before="0" w:after="0" w:line="220" w:lineRule="exact"/>
-      </w:pPr>
-      <w:r>
-        <w:rPr>
-          <w:rFonts w:ascii="Consolas" w:hAnsi="Consolas" w:cs="Times New Roman"/>
-          <w:sz w:val="20"/>
-          <w:color w:val="000000"/>
-        </w:rPr>
-        <w:t xml:space="preserve">    public String getColor() { return color; }</w:t>
-      </w:r>
-    </w:p>
-    <w:p>
-      <w:pPr>
-        <w:pStyle w:val="a"/>
-        <w:widowControl/>
-        <w:jc w:val="left"/>
-        <w:spacing w:before="0" w:after="0" w:line="220" w:lineRule="exact"/>
-      </w:pPr>
-      <w:r>
-        <w:rPr>
-          <w:rFonts w:ascii="Consolas" w:hAnsi="Consolas" w:cs="Times New Roman"/>
-          <w:sz w:val="20"/>
-          <w:color w:val="000000"/>
-        </w:rPr>
-        <w:t xml:space="preserve">    public void setColor(String color) { this.color = color; }</w:t>
-      </w:r>
-    </w:p>
-    <w:p>
-      <w:pPr>
-        <w:pStyle w:val="a"/>
-        <w:widowControl/>
-        <w:jc w:val="left"/>
-        <w:spacing w:before="0" w:after="0" w:line="220" w:lineRule="exact"/>
-      </w:pPr>
-      <w:r>
-        <w:rPr>
-          <w:rFonts w:ascii="Consolas" w:hAnsi="Consolas" w:cs="Times New Roman"/>
-          <w:sz w:val="20"/>
-          <w:color w:val="000000"/>
-        </w:rPr>
-        <w:t xml:space="preserve">    public int getYear() { return year; }</w:t>
-      </w:r>
-    </w:p>
-    <w:p>
-      <w:pPr>
-        <w:pStyle w:val="a"/>
-        <w:widowControl/>
-        <w:jc w:val="left"/>
-        <w:spacing w:before="0" w:after="0" w:line="220" w:lineRule="exact"/>
-      </w:pPr>
-      <w:r>
-        <w:rPr>
-          <w:rFonts w:ascii="Consolas" w:hAnsi="Consolas" w:cs="Times New Roman"/>
-          <w:sz w:val="20"/>
-          <w:color w:val="000000"/>
-        </w:rPr>
-        <w:t xml:space="preserve">    public void setYear(int year) { this.year = year; }</w:t>
-      </w:r>
-    </w:p>
-    <w:p>
-      <w:pPr>
-        <w:pStyle w:val="a"/>
-        <w:widowControl/>
-        <w:jc w:val="left"/>
-        <w:spacing w:before="0" w:after="0" w:line="220" w:lineRule="exact"/>
-      </w:pPr>
-      <w:r>
-        <w:rPr>
-          <w:rFonts w:ascii="Consolas" w:hAnsi="Consolas" w:cs="Times New Roman"/>
-          <w:sz w:val="20"/>
-          <w:color w:val="000000"/>
-        </w:rPr>
-        <w:t xml:space="preserve"/>
-      </w:r>
-    </w:p>
-    <w:p>
-      <w:pPr>
-        <w:pStyle w:val="a"/>
-        <w:widowControl/>
-        <w:jc w:val="left"/>
-        <w:spacing w:before="0" w:after="0" w:line="220" w:lineRule="exact"/>
-      </w:pPr>
-      <w:r>
-        <w:rPr>
-          <w:rFonts w:ascii="Consolas" w:hAnsi="Consolas" w:cs="Times New Roman"/>
-          <w:sz w:val="20"/>
-          <w:color w:val="000000"/>
-        </w:rPr>
-        <w:t xml:space="preserve">    public int getAge() {</w:t>
-      </w:r>
-    </w:p>
-    <w:p>
-      <w:pPr>
-        <w:pStyle w:val="a"/>
-        <w:widowControl/>
-        <w:jc w:val="left"/>
-        <w:spacing w:before="0" w:after="0" w:line="220" w:lineRule="exact"/>
-      </w:pPr>
-      <w:r>
-        <w:rPr>
-          <w:rFonts w:ascii="Consolas" w:hAnsi="Consolas" w:cs="Times New Roman"/>
-          <w:sz w:val="20"/>
-          <w:color w:val="000000"/>
-        </w:rPr>
-        <w:t xml:space="preserve">        return Year.now().getValue() - year;</w:t>
-      </w:r>
-    </w:p>
-    <w:p>
-      <w:pPr>
-        <w:pStyle w:val="a"/>
-        <w:widowControl/>
-        <w:jc w:val="left"/>
-        <w:spacing w:before="0" w:after="0" w:line="220" w:lineRule="exact"/>
-      </w:pPr>
-      <w:r>
-        <w:rPr>
-          <w:rFonts w:ascii="Consolas" w:hAnsi="Consolas" w:cs="Times New Roman"/>
-          <w:sz w:val="20"/>
-          <w:color w:val="000000"/>
-        </w:rPr>
-        <w:t xml:space="preserve">    }</w:t>
-      </w:r>
-    </w:p>
-    <w:p>
-      <w:pPr>
-        <w:pStyle w:val="a"/>
-        <w:widowControl/>
-        <w:jc w:val="left"/>
-        <w:spacing w:before="0" w:after="0" w:line="220" w:lineRule="exact"/>
-      </w:pPr>
-      <w:r>
-        <w:rPr>
-          <w:rFonts w:ascii="Consolas" w:hAnsi="Consolas" w:cs="Times New Roman"/>
-          <w:sz w:val="20"/>
-          <w:color w:val="000000"/>
-        </w:rPr>
-        <w:t xml:space="preserve"/>
-      </w:r>
-    </w:p>
-    <w:p>
-      <w:pPr>
-        <w:pStyle w:val="a"/>
-        <w:widowControl/>
-        <w:jc w:val="left"/>
-        <w:spacing w:before="0" w:after="0" w:line="220" w:lineRule="exact"/>
-      </w:pPr>
-      <w:r>
-        <w:rPr>
-          <w:rFonts w:ascii="Consolas" w:hAnsi="Consolas" w:cs="Times New Roman"/>
-          <w:sz w:val="20"/>
-          <w:color w:val="000000"/>
-        </w:rPr>
-        <w:t xml:space="preserve">    public void To_String() {</w:t>
-      </w:r>
-    </w:p>
-    <w:p>
-      <w:pPr>
-        <w:pStyle w:val="a"/>
-        <w:widowControl/>
-        <w:jc w:val="left"/>
-        <w:spacing w:before="0" w:after="0" w:line="220" w:lineRule="exact"/>
-      </w:pPr>
-      <w:r>
-        <w:rPr>
-          <w:rFonts w:ascii="Consolas" w:hAnsi="Consolas" w:cs="Times New Roman"/>
-          <w:sz w:val="20"/>
-          <w:color w:val="000000"/>
-        </w:rPr>
-        <w:t xml:space="preserve">        System.out.println(model + ", " + license + ", " + color + ", " + year);</w:t>
-      </w:r>
-    </w:p>
-    <w:p>
-      <w:pPr>
-        <w:pStyle w:val="a"/>
-        <w:widowControl/>
-        <w:jc w:val="left"/>
-        <w:spacing w:before="0" w:after="0" w:line="220" w:lineRule="exact"/>
-      </w:pPr>
-      <w:r>
-        <w:rPr>
-          <w:rFonts w:ascii="Consolas" w:hAnsi="Consolas" w:cs="Times New Roman"/>
-          <w:sz w:val="20"/>
-          <w:color w:val="000000"/>
-        </w:rPr>
-        <w:t xml:space="preserve">    }</w:t>
-      </w:r>
-    </w:p>
-    <w:p>
-      <w:pPr>
-        <w:pStyle w:val="a"/>
-        <w:widowControl/>
-        <w:jc w:val="left"/>
-        <w:spacing w:before="0" w:after="0" w:line="220" w:lineRule="exact"/>
-      </w:pPr>
-      <w:r>
-        <w:rPr>
-          <w:rFonts w:ascii="Consolas" w:hAnsi="Consolas" w:cs="Times New Roman"/>
-          <w:sz w:val="20"/>
-          <w:color w:val="000000"/>
-        </w:rPr>
-        <w:t xml:space="preserve">}</w:t>
-      </w:r>
-    </w:p>
-    <w:p>
-      <w:pPr>
-        <w:pStyle w:val="1"/>
-        <w:ind w:firstLine="709"/>
-        <w:pageBreakBefore/>
-        <w:jc w:val="left"/>
-      </w:pPr>
-      <w:r>
-        <w:rPr>
-          <w:color w:val="000000"/>
-        </w:rPr>
         <w:t>Результаты запуска программ</w:t>
       </w:r>
     </w:p>

</xml_diff>